<commit_message>
docs(entrega-final): corrige corrupção do docx e adiciona rastreabilidade de requisitos
- _force_update_fields agora injeta <w:updateFields> via string-level edit
  no settings.xml. O round-trip anterior com ElementTree renomeava todos
  os prefixos de namespace para ns0/ns1/..., quebrando mc:Ignorable (que
  referencia w14/w15/w16... por nome) e fazendo o Word reportar o arquivo
  como corrompido.
- Nova seção 9.11 "Rastreabilidade de requisitos" mapeia cada RF e RNF
  ao código, schema, módulo de UI e testes que o implementam.

Co-Authored-By: Claude Opus 4.7 <noreply@anthropic.com>
</commit_message>
<xml_diff>
--- a/docs/entrega-final/GymControl_ProjetoFinal.docx
+++ b/docs/entrega-final/GymControl_ProjetoFinal.docx
@@ -14527,6 +14527,138 @@
       <w:pPr/>
       <w:r>
         <w:t>O front-end está hospedado na Vercel em https://gym-control-pearl.vercel.app — deploy automático a cada push para main. A infraestrutura AWS necessária para o back-end está totalmente escrita como código em infra/terraform/: VPC com duas sub-redes privadas em zonas distintas (sem IGW, sem NAT, sem custo extra de tráfego); RDS MySQL 8 t4g.micro (free-tier por 12 meses), criptografado, em sub-rede privada; ECR para a imagem; App Runner com VPC connector para falar com o RDS, capacidade fixada em uma única instância com concorrência máxima de 25 requisições (controle de custo); Secrets Manager guardando a senha do banco e o JWT_SECRET (ambos gerados aleatoriamente pelo Terraform); CloudWatch Logs com retenção de 7 dias; AWS Budgets opcional com alertas por e-mail. O deploy real não foi efetivado para esta entrega (custo estimado de $20 USD nos dois meses do projeto), mas todo o ferramental está pronto: bastaria executar terraform apply seguido do script scripts/aws-deploy.sh.</w:t>
+      </w:r>
+    </w:p>
+    <w:p>
+      <w:pPr>
+        <w:pStyle w:val="Ttulo2"/>
+      </w:pPr>
+      <w:r>
+        <w:t>9.11 Rastreabilidade de requisitos</w:t>
+      </w:r>
+    </w:p>
+    <w:p>
+      <w:pPr/>
+      <w:r>
+        <w:t>Esta seção mapeia cada requisito do capítulo 4 ao artefato concreto que o implementa, demonstrando que todos foram efetivamente entregues. Os requisitos funcionais (RF) são listados primeiro, seguidos dos requisitos não funcionais (RNF). Caminhos referem-se à raiz do repositório.</w:t>
+      </w:r>
+    </w:p>
+    <w:p>
+      <w:pPr>
+        <w:pStyle w:val="Ttulo3"/>
+      </w:pPr>
+      <w:r>
+        <w:t>Requisitos funcionais</w:t>
+      </w:r>
+    </w:p>
+    <w:p>
+      <w:pPr/>
+      <w:r>
+        <w:t>RF01 — Cadastro de alunos: rota POST /api/alunos em server.js, restrita ao perfil Admin pelo middleware requireRole; tabela alunos em sql/01_schema.sql com UNIQUE em CPF e validação de dígito verificador em lib/validators.js. Tela: public/index.html → seção #secAlunos, módulo public/js/alunos.js. Testes: tests/api.test.js (criação válida, CPF inválido, CPF duplicado) e tests/e2e/alunos.spec.js (CRUD com máscara de CPF).</w:t>
+      </w:r>
+    </w:p>
+    <w:p>
+      <w:pPr/>
+      <w:r>
+        <w:t>RF02 — Edição e exclusão de alunos: rotas PUT /api/alunos/:id e DELETE /api/alunos/:id em server.js, RBAC Admin; FK de pagamentos e frequencias com ON DELETE CASCADE garante consistência. Tela e ações no mesmo módulo public/js/alunos.js. Testes em tests/api.test.js e tests/e2e/alunos.spec.js.</w:t>
+      </w:r>
+    </w:p>
+    <w:p>
+      <w:pPr/>
+      <w:r>
+        <w:t>RF03 — Cadastro de professores: rota POST /api/professores em server.js, RBAC Admin; tabela professores com UNIQUE em CREF; módulo public/js/professores.js. Testes: tests/api.test.js e tests/e2e/professores.spec.js.</w:t>
+      </w:r>
+    </w:p>
+    <w:p>
+      <w:pPr/>
+      <w:r>
+        <w:t>RF04 — Cadastro de planos: rotas /api/planos em server.js, RBAC Admin; tabela planos em sql/01_schema.sql; módulo public/js/planos.js. Testes: tests/api.test.js.</w:t>
+      </w:r>
+    </w:p>
+    <w:p>
+      <w:pPr/>
+      <w:r>
+        <w:t>RF05 — Registrar pagamentos: rota POST /api/pagamentos em server.js, RBAC Admin; tabela pagamentos com FK para alunos e planos, ENUM (metodo, status) e CHECK valor &gt; 0; módulo public/js/pagamentos.js. Testes: tests/api.test.js e tests/e2e/pagamentos.spec.js.</w:t>
+      </w:r>
+    </w:p>
+    <w:p>
+      <w:pPr/>
+      <w:r>
+        <w:t>RF06 — Consultar inadimplentes: rota GET /api/inadimplentes em server.js (query com LEFT JOIN entre alunos e pagamentos do mês corrente), RBAC Admin; módulo public/js/inadimplentes.js. Teste visual de RBAC em tests/e2e/rbac.spec.js (aluno não vê o menu).</w:t>
+      </w:r>
+    </w:p>
+    <w:p>
+      <w:pPr/>
+      <w:r>
+        <w:t>RF07 — Cadastro de treinos: rotas /api/treinos e /api/treinos/:id/exercicios em server.js, RBAC Professor (e Admin); tabelas treinos e exercicios em sql/01_schema.sql com FK CASCADE; módulo public/js/professor.js. Teste E2E em tests/e2e/professor.spec.js (criação de treino com exercícios).</w:t>
+      </w:r>
+    </w:p>
+    <w:p>
+      <w:pPr/>
+      <w:r>
+        <w:t>RF08 — Vincular treinos a alunos: coluna aluno_id na tabela treinos com FK; tela do professor seleciona o aluno antes de criar o treino; endpoint GET /api/alunos/me/treinos serve o painel do aluno (public/js/aluno.js). Testes em tests/api.test.js.</w:t>
+      </w:r>
+    </w:p>
+    <w:p>
+      <w:pPr/>
+      <w:r>
+        <w:t>RF09 — Registrar frequência: rota POST /api/frequencias em server.js; tabela frequencias com FK para alunos e UNIQUE (aluno_id, data); módulo public/js/frequencia.js. Teste E2E em tests/e2e/frequencia.spec.js (registro de check-in).</w:t>
+      </w:r>
+    </w:p>
+    <w:p>
+      <w:pPr/>
+      <w:r>
+        <w:t>RF10 — Relatórios: dashboard em public/js/dashboard.js consome GET /api/dashboard/metrics, que retorna totais de alunos ativos, pagamentos do mês, inadimplentes e check-ins do dia (consultas agregadas em SQL). RBAC Admin. Testes em tests/api.test.js.</w:t>
+      </w:r>
+    </w:p>
+    <w:p>
+      <w:pPr>
+        <w:pStyle w:val="Ttulo3"/>
+      </w:pPr>
+      <w:r>
+        <w:t>Requisitos não funcionais</w:t>
+      </w:r>
+    </w:p>
+    <w:p>
+      <w:pPr/>
+      <w:r>
+        <w:t>RNF01 — Interface simples e intuitiva: SPA com menu lateral fixo (public/index.html), Tailwind CSS aplicando paleta consistente em public/styles.css, navegação por data-action sem recarregar a página. Validações em tempo real (máscara de CPF, formato de e-mail) reduzem erros de digitação.</w:t>
+      </w:r>
+    </w:p>
+    <w:p>
+      <w:pPr/>
+      <w:r>
+        <w:t>RNF02 — Controle de acesso por tipo de usuário: middleware requireAuth + requireRole em lib/auth.js aplicado a cada rota /api/* conforme matriz do QUADRO 3 (Admin, Professor, Aluno); três perfis no schema (tabela usuarios.tipo); front-end esconde menus por perfil em public/js/core.js. Testes: 12 cenários em tests/api.test.js + tests/api.extra.test.js cobrem cada combinação papel × rota; tests/e2e/rbac.spec.js valida visibilidade do menu.</w:t>
+      </w:r>
+    </w:p>
+    <w:p>
+      <w:pPr/>
+      <w:r>
+        <w:t>RNF03 — Banco relacional: MySQL 8, schema normalizado em 8 tabelas (sql/01_schema.sql) com FKs, ENUMs, UNIQUE, CHECK e índices em todas as FKs. Conformidade ACID herdada do MySQL (InnoDB).</w:t>
+      </w:r>
+    </w:p>
+    <w:p>
+      <w:pPr/>
+      <w:r>
+        <w:t>RNF04 — Acessível por navegador: aplicação web servida por Express em server.js; front-end estático compatível com qualquer navegador moderno; nenhuma instalação cliente necessária. Front-end já publicado em https://gym-control-pearl.vercel.app.</w:t>
+      </w:r>
+    </w:p>
+    <w:p>
+      <w:pPr/>
+      <w:r>
+        <w:t>RNF05 — Boa organização visual: hierarquia clara (header com identificação do perfil, menu lateral por domínio, área principal com tabelas paginadas e formulários alinhados); espaçamento e tipografia consistentes via classes utilitárias do Tailwind; ícones discretos guiando ações primárias.</w:t>
+      </w:r>
+    </w:p>
+    <w:p>
+      <w:pPr/>
+      <w:r>
+        <w:t>RNF06 — Consultas rápidas: connection pool do mysql2 (10 conexões) em server.js; índices em todas as FKs e em campos de busca (CPF, e-mail, data de pagamento); paginação no front-end. As consultas do dashboard são todas O(1) em número de tabelas tocadas, com agregação feita no SQL e não em JavaScript.</w:t>
+      </w:r>
+    </w:p>
+    <w:p>
+      <w:pPr/>
+      <w:r>
+        <w:t>RNF07 — Proteger informações dos usuários: senhas em bcrypt (custo 10) — nunca em texto plano; sessão por JWT em cookie httpOnly + __Secure- + SameSite=Strict (sem acesso por JavaScript do cliente); todas as queries parametrizadas (sem SQL injection); helmet com CSP estrita, HSTS, X-Frame-Options DENY; rate-limit em /api/auth/login (5/min) defendendo contra força bruta; sanitizador de logs em lib/log-sanitizer.js remove CPF, e-mail, hash e token antes de imprimir; JWT_SECRET obrigatório em produção. Detalhamento completo em docs/entrega-final/added/seguranca.md.</w:t>
       </w:r>
     </w:p>
     <w:p>

</xml_diff>

<commit_message>
docs(entrega-final): força refresh também das listas de quadros e figuras
O setting global updateFields no settings.xml atualiza o Sumário principal
(TOC \o) mas Word não revalida tabelas de figuras (TOC \c "FIGURA" /
"QUADRO") nessa rota — os campos mantêm o texto cacheado entre
<w:fldChar separate/> e <w:fldChar end/>. Solução: marcar
w:dirty="true" no fldChar begin de todo campo TOC, o que obriga o
Word a recalcular cada um na abertura.

Co-Authored-By: Claude Opus 4.7 <noreply@anthropic.com>
</commit_message>
<xml_diff>
--- a/docs/entrega-final/GymControl_ProjetoFinal.docx
+++ b/docs/entrega-final/GymControl_ProjetoFinal.docx
@@ -613,7 +613,7 @@
         </w:tabs>
       </w:pPr>
       <w:r>
-        <w:fldChar w:fldCharType="begin"/>
+        <w:fldChar w:fldCharType="begin" w:dirty="true"/>
       </w:r>
       <w:r>
         <w:instrText xml:space="preserve"> TOC \c "QUADRO" \h </w:instrText>
@@ -880,7 +880,7 @@
         </w:tabs>
       </w:pPr>
       <w:r>
-        <w:fldChar w:fldCharType="begin"/>
+        <w:fldChar w:fldCharType="begin" w:dirty="true"/>
       </w:r>
       <w:r>
         <w:instrText xml:space="preserve"> TOC \c "FIGURA" \h </w:instrText>
@@ -994,7 +994,7 @@
             </w:tabs>
           </w:pPr>
           <w:r>
-            <w:fldChar w:fldCharType="begin"/>
+            <w:fldChar w:fldCharType="begin" w:dirty="true"/>
           </w:r>
           <w:r>
             <w:rPr>

</xml_diff>

<commit_message>
docs(entrega-final): apaga cache dos campos TOC para forçar recálculo limpo
Substitui o regex anterior (que casava só TOC sem aninhamento) por um
walker que conta begin/end. Necessário porque entradas do Sumário
embutem campos PAGEREF com seus próprios pares begin/end — o .*?
não-guloso parava no primeiro PAGEREF aninhado e deixava ~11kB do
Sumário cacheado.

Agora, ao abrir o docx, o Word não tem nenhum número de página
cacheado para mostrar como fallback: ele tem que recalcular tudo
contra a paginação real do documento já finalizado, eliminando o
off-by-one nas listas de Quadros e Figuras.

Co-Authored-By: Claude Opus 4.7 <noreply@anthropic.com>
</commit_message>
<xml_diff>
--- a/docs/entrega-final/GymControl_ProjetoFinal.docx
+++ b/docs/entrega-final/GymControl_ProjetoFinal.docx
@@ -620,16 +620,32 @@
       </w:r>
       <w:r>
         <w:fldChar w:fldCharType="separate"/>
-      </w:r>
-      <w:hyperlink w:anchor="QUADRO!0|sequence">
         <w:r>
-          <w:t>QUADRO 1 – Requisitos funcionais do sistema GymControl</w:t>
+          <w:t xml:space="preserve">Atualize os campos (F9).</w:t>
         </w:r>
-        <w:r>
-          <w:tab/>
-          <w:t>10</w:t>
-        </w:r>
-      </w:hyperlink>
+        <w:fldChar w:fldCharType="end"/>
+      </w:r>
+    </w:p>
+    <w:p>
+      <w:r>
+        <w:br w:type="page"/>
+      </w:r>
+    </w:p>
+    <w:p>
+      <w:pPr>
+        <w:spacing w:after="360"/>
+        <w:jc w:val="center"/>
+      </w:pPr>
+      <w:r>
+        <w:rPr>
+          <w:b/>
+          <w:bCs/>
+          <w:sz w:val="32"/>
+          <w:szCs w:val="32"/>
+        </w:rPr>
+        <w:lastRenderedPageBreak/>
+        <w:t>LISTA DE FIGURAS</w:t>
+      </w:r>
     </w:p>
     <w:p>
       <w:pPr>
@@ -639,319 +655,17 @@
           <w:tab w:val="right" w:leader="dot" w:pos="9070"/>
         </w:tabs>
       </w:pPr>
-      <w:hyperlink w:anchor="QUADRO!1|sequence">
+      <w:r>
+        <w:fldChar w:fldCharType="begin" w:dirty="true"/>
+      </w:r>
+      <w:r>
+        <w:instrText xml:space="preserve"> TOC \c "FIGURA" \h </w:instrText>
+      </w:r>
+      <w:r>
+        <w:fldChar w:fldCharType="separate"/>
         <w:r>
-          <w:t>QUADRO 2 – Requisitos não funcionais do sistema GymControl</w:t>
+          <w:t xml:space="preserve">Atualize os campos (F9).</w:t>
         </w:r>
-        <w:r>
-          <w:tab/>
-          <w:t>10</w:t>
-        </w:r>
-      </w:hyperlink>
-    </w:p>
-    <w:p>
-      <w:pPr>
-        <w:pStyle w:val="ndicedeilustraes"/>
-        <w:tabs>
-          <w:tab w:val="clear" w:pos="9071"/>
-          <w:tab w:val="right" w:leader="dot" w:pos="9070"/>
-        </w:tabs>
-      </w:pPr>
-      <w:hyperlink w:anchor="QUADRO!2|sequence">
-        <w:r>
-          <w:t>QUADRO 3 – Atores e casos de uso do sistema GymControl</w:t>
-        </w:r>
-        <w:r>
-          <w:tab/>
-          <w:t>13</w:t>
-        </w:r>
-      </w:hyperlink>
-    </w:p>
-    <w:p>
-      <w:pPr>
-        <w:pStyle w:val="ndicedeilustraes"/>
-        <w:tabs>
-          <w:tab w:val="clear" w:pos="9071"/>
-          <w:tab w:val="right" w:leader="dot" w:pos="9070"/>
-        </w:tabs>
-      </w:pPr>
-      <w:hyperlink w:anchor="QUADRO!3|sequence">
-        <w:r>
-          <w:t>QUADRO 4 – Descrição do caso de uso Cadastrar Aluno</w:t>
-        </w:r>
-        <w:r>
-          <w:tab/>
-          <w:t>14</w:t>
-        </w:r>
-      </w:hyperlink>
-    </w:p>
-    <w:p>
-      <w:pPr>
-        <w:pStyle w:val="ndicedeilustraes"/>
-        <w:tabs>
-          <w:tab w:val="clear" w:pos="9071"/>
-          <w:tab w:val="right" w:leader="dot" w:pos="9070"/>
-        </w:tabs>
-      </w:pPr>
-      <w:hyperlink w:anchor="QUADRO!4|sequence">
-        <w:r>
-          <w:t>QUADRO 5 – Descrição do caso de uso Registrar Pagamento</w:t>
-        </w:r>
-        <w:r>
-          <w:tab/>
-          <w:t>14</w:t>
-        </w:r>
-      </w:hyperlink>
-    </w:p>
-    <w:p>
-      <w:pPr>
-        <w:pStyle w:val="ndicedeilustraes"/>
-        <w:tabs>
-          <w:tab w:val="clear" w:pos="9071"/>
-          <w:tab w:val="right" w:leader="dot" w:pos="9070"/>
-        </w:tabs>
-      </w:pPr>
-      <w:hyperlink w:anchor="QUADRO!5|sequence">
-        <w:r>
-          <w:t>QUADRO 6 – Descrição do caso de uso Cadastrar Treino</w:t>
-        </w:r>
-        <w:r>
-          <w:tab/>
-          <w:t>14</w:t>
-        </w:r>
-      </w:hyperlink>
-    </w:p>
-    <w:p>
-      <w:pPr>
-        <w:pStyle w:val="ndicedeilustraes"/>
-        <w:tabs>
-          <w:tab w:val="clear" w:pos="9071"/>
-          <w:tab w:val="right" w:leader="dot" w:pos="9070"/>
-        </w:tabs>
-      </w:pPr>
-      <w:hyperlink w:anchor="QUADRO!6|sequence">
-        <w:r>
-          <w:t>QUADRO 7 – Sequência de mensagens — registrar pagamento de mensalidade</w:t>
-        </w:r>
-        <w:r>
-          <w:tab/>
-          <w:t>16</w:t>
-        </w:r>
-      </w:hyperlink>
-    </w:p>
-    <w:p>
-      <w:pPr>
-        <w:pStyle w:val="ndicedeilustraes"/>
-        <w:tabs>
-          <w:tab w:val="clear" w:pos="9071"/>
-          <w:tab w:val="right" w:leader="dot" w:pos="9070"/>
-        </w:tabs>
-      </w:pPr>
-      <w:hyperlink w:anchor="QUADRO!7|sequence">
-        <w:r>
-          <w:t>QUADRO 8 – Principais classes do sistema e seus atributos</w:t>
-        </w:r>
-        <w:r>
-          <w:tab/>
-          <w:t>18</w:t>
-        </w:r>
-      </w:hyperlink>
-    </w:p>
-    <w:p>
-      <w:pPr>
-        <w:pStyle w:val="ndicedeilustraes"/>
-        <w:tabs>
-          <w:tab w:val="clear" w:pos="9071"/>
-          <w:tab w:val="right" w:leader="dot" w:pos="9070"/>
-        </w:tabs>
-      </w:pPr>
-      <w:hyperlink w:anchor="QUADRO!8|sequence">
-        <w:r>
-          <w:t>QUADRO 9 – Relacionamentos entre as classes do sistema</w:t>
-        </w:r>
-        <w:r>
-          <w:tab/>
-          <w:t>18</w:t>
-        </w:r>
-      </w:hyperlink>
-    </w:p>
-    <w:p>
-      <w:pPr>
-        <w:pStyle w:val="ndicedeilustraes"/>
-        <w:tabs>
-          <w:tab w:val="clear" w:pos="9071"/>
-          <w:tab w:val="right" w:leader="dot" w:pos="9070"/>
-        </w:tabs>
-      </w:pPr>
-      <w:hyperlink w:anchor="QUADRO!9|sequence">
-        <w:r>
-          <w:t>QUADRO 10 – Componentes do sistema GymControl</w:t>
-        </w:r>
-        <w:r>
-          <w:tab/>
-          <w:t>20</w:t>
-        </w:r>
-      </w:hyperlink>
-    </w:p>
-    <w:p>
-      <w:pPr>
-        <w:pStyle w:val="ndicedeilustraes"/>
-        <w:tabs>
-          <w:tab w:val="clear" w:pos="9071"/>
-          <w:tab w:val="right" w:leader="dot" w:pos="9070"/>
-        </w:tabs>
-      </w:pPr>
-      <w:hyperlink w:anchor="QUADRO!10|sequence">
-        <w:r>
-          <w:t>QUADRO 11 – Tecnologias escolhidas para o desenvolvimento do sistema</w:t>
-        </w:r>
-        <w:r>
-          <w:tab/>
-          <w:t>21</w:t>
-        </w:r>
-      </w:hyperlink>
-    </w:p>
-    <w:p>
-      <w:pPr>
-        <w:pStyle w:val="ndicedeilustraes"/>
-        <w:tabs>
-          <w:tab w:val="clear" w:pos="9071"/>
-          <w:tab w:val="right" w:leader="dot" w:pos="9070"/>
-        </w:tabs>
-      </w:pPr>
-      <w:hyperlink w:anchor="QUADRO!11|sequence">
-        <w:r>
-          <w:t>QUADRO 12 – Cronograma de desenvolvimento do sistema</w:t>
-        </w:r>
-        <w:r>
-          <w:tab/>
-          <w:t>22</w:t>
-        </w:r>
-      </w:hyperlink>
-    </w:p>
-    <w:p>
-      <w:pPr>
-        <w:pStyle w:val="ndicedeilustraes"/>
-        <w:tabs>
-          <w:tab w:val="clear" w:pos="9071"/>
-          <w:tab w:val="right" w:leader="dot" w:pos="9070"/>
-        </w:tabs>
-      </w:pPr>
-      <w:hyperlink w:anchor="QUADRO!12|sequence">
-        <w:r>
-          <w:t>QUADRO 13 – Estimativa de orçamento para o desenvolvimento</w:t>
-        </w:r>
-        <w:r>
-          <w:tab/>
-          <w:t>23</w:t>
-        </w:r>
-      </w:hyperlink>
-      <w:r>
-        <w:fldChar w:fldCharType="end"/>
-      </w:r>
-    </w:p>
-    <w:p>
-      <w:r>
-        <w:br w:type="page"/>
-      </w:r>
-    </w:p>
-    <w:p>
-      <w:pPr>
-        <w:spacing w:after="360"/>
-        <w:jc w:val="center"/>
-      </w:pPr>
-      <w:r>
-        <w:rPr>
-          <w:b/>
-          <w:bCs/>
-          <w:sz w:val="32"/>
-          <w:szCs w:val="32"/>
-        </w:rPr>
-        <w:lastRenderedPageBreak/>
-        <w:t>LISTA DE FIGURAS</w:t>
-      </w:r>
-    </w:p>
-    <w:p>
-      <w:pPr>
-        <w:pStyle w:val="ndicedeilustraes"/>
-        <w:tabs>
-          <w:tab w:val="clear" w:pos="9071"/>
-          <w:tab w:val="right" w:leader="dot" w:pos="9070"/>
-        </w:tabs>
-      </w:pPr>
-      <w:r>
-        <w:fldChar w:fldCharType="begin" w:dirty="true"/>
-      </w:r>
-      <w:r>
-        <w:instrText xml:space="preserve"> TOC \c "FIGURA" \h </w:instrText>
-      </w:r>
-      <w:r>
-        <w:fldChar w:fldCharType="separate"/>
-      </w:r>
-      <w:hyperlink w:anchor="FIGURA!0|sequence">
-        <w:r>
-          <w:t>FIGURA 1 – Diagrama de Caso de Uso do sistema GymControl</w:t>
-        </w:r>
-        <w:r>
-          <w:tab/>
-          <w:t>13</w:t>
-        </w:r>
-      </w:hyperlink>
-    </w:p>
-    <w:p>
-      <w:pPr>
-        <w:pStyle w:val="ndicedeilustraes"/>
-        <w:tabs>
-          <w:tab w:val="clear" w:pos="9071"/>
-          <w:tab w:val="right" w:leader="dot" w:pos="9070"/>
-        </w:tabs>
-      </w:pPr>
-      <w:hyperlink w:anchor="FIGURA!1|sequence">
-        <w:r>
-          <w:t>FIGURA 2 – Diagrama de Sequência: registrar pagamento de mensalidade</w:t>
-        </w:r>
-        <w:r>
-          <w:tab/>
-          <w:t>16</w:t>
-        </w:r>
-      </w:hyperlink>
-    </w:p>
-    <w:p>
-      <w:pPr>
-        <w:pStyle w:val="ndicedeilustraes"/>
-        <w:tabs>
-          <w:tab w:val="clear" w:pos="9071"/>
-          <w:tab w:val="right" w:leader="dot" w:pos="9070"/>
-        </w:tabs>
-      </w:pPr>
-      <w:hyperlink w:anchor="FIGURA!2|sequence">
-        <w:r>
-          <w:t>FIGURA 3 – Diagrama de Classe do sistema GymControl</w:t>
-        </w:r>
-        <w:r>
-          <w:tab/>
-          <w:t>18</w:t>
-        </w:r>
-      </w:hyperlink>
-    </w:p>
-    <w:p>
-      <w:pPr>
-        <w:pStyle w:val="ndicedeilustraes"/>
-        <w:tabs>
-          <w:tab w:val="clear" w:pos="9071"/>
-          <w:tab w:val="right" w:leader="dot" w:pos="9070"/>
-        </w:tabs>
-      </w:pPr>
-      <w:hyperlink w:anchor="FIGURA!3|sequence">
-        <w:r>
-          <w:t>FIGURA 4 – Diagrama de Componentes do sistema GymControl</w:t>
-        </w:r>
-        <w:r>
-          <w:tab/>
-          <w:t>20</w:t>
-        </w:r>
-      </w:hyperlink>
-      <w:r>
         <w:fldChar w:fldCharType="end"/>
       </w:r>
     </w:p>
@@ -1007,588 +721,9 @@
               <w:rStyle w:val="IndexLink"/>
             </w:rPr>
             <w:fldChar w:fldCharType="separate"/>
-          </w:r>
-          <w:hyperlink w:anchor="__RefHeading___Toc1313_3344478164">
-            <w:r>
-              <w:rPr>
-                <w:rStyle w:val="IndexLink"/>
-              </w:rPr>
-              <w:t>1 INTRODUÇÃO</w:t>
-            </w:r>
-            <w:r>
-              <w:rPr>
-                <w:rStyle w:val="IndexLink"/>
-              </w:rPr>
-              <w:tab/>
-              <w:t>7</w:t>
-            </w:r>
-          </w:hyperlink>
-        </w:p>
-        <w:p>
-          <w:pPr>
-            <w:pStyle w:val="Sumrio1"/>
-            <w:tabs>
-              <w:tab w:val="clear" w:pos="9071"/>
-              <w:tab w:val="right" w:leader="dot" w:pos="9070"/>
-            </w:tabs>
-          </w:pPr>
-          <w:hyperlink w:anchor="__RefHeading___Toc1315_3344478164">
-            <w:r>
-              <w:rPr>
-                <w:rStyle w:val="IndexLink"/>
-              </w:rPr>
-              <w:t>2 DESCRITIVO COMPUTACIONAL DO SOFTWARE</w:t>
-            </w:r>
-            <w:r>
-              <w:rPr>
-                <w:rStyle w:val="IndexLink"/>
-              </w:rPr>
-              <w:tab/>
-              <w:t>8</w:t>
-            </w:r>
-          </w:hyperlink>
-        </w:p>
-        <w:p>
-          <w:pPr>
-            <w:pStyle w:val="Sumrio1"/>
-            <w:tabs>
-              <w:tab w:val="clear" w:pos="9071"/>
-              <w:tab w:val="right" w:leader="dot" w:pos="9070"/>
-            </w:tabs>
-          </w:pPr>
-          <w:hyperlink w:anchor="__RefHeading___Toc1317_3344478164">
-            <w:r>
-              <w:rPr>
-                <w:rStyle w:val="IndexLink"/>
-              </w:rPr>
-              <w:t>3 CARACTERIZAÇÃO DO SISTEMA</w:t>
-            </w:r>
-            <w:r>
-              <w:rPr>
-                <w:rStyle w:val="IndexLink"/>
-              </w:rPr>
-              <w:tab/>
-              <w:t>9</w:t>
-            </w:r>
-          </w:hyperlink>
-        </w:p>
-        <w:p>
-          <w:pPr>
-            <w:pStyle w:val="Sumrio2"/>
-            <w:tabs>
-              <w:tab w:val="clear" w:pos="8788"/>
-              <w:tab w:val="right" w:leader="dot" w:pos="9070"/>
-            </w:tabs>
-          </w:pPr>
-          <w:hyperlink w:anchor="__RefHeading___Toc1319_3344478164">
-            <w:r>
-              <w:rPr>
-                <w:rStyle w:val="IndexLink"/>
-              </w:rPr>
-              <w:t>3.1 Nome do sistema</w:t>
-            </w:r>
-            <w:r>
-              <w:rPr>
-                <w:rStyle w:val="IndexLink"/>
-              </w:rPr>
-              <w:tab/>
-              <w:t>9</w:t>
-            </w:r>
-          </w:hyperlink>
-        </w:p>
-        <w:p>
-          <w:pPr>
-            <w:pStyle w:val="Sumrio2"/>
-            <w:tabs>
-              <w:tab w:val="clear" w:pos="8788"/>
-              <w:tab w:val="right" w:leader="dot" w:pos="9070"/>
-            </w:tabs>
-          </w:pPr>
-          <w:hyperlink w:anchor="__RefHeading___Toc1321_3344478164">
-            <w:r>
-              <w:rPr>
-                <w:rStyle w:val="IndexLink"/>
-              </w:rPr>
-              <w:t>3.2 Objetivo do sistema</w:t>
-            </w:r>
-            <w:r>
-              <w:rPr>
-                <w:rStyle w:val="IndexLink"/>
-              </w:rPr>
-              <w:tab/>
-              <w:t>9</w:t>
-            </w:r>
-          </w:hyperlink>
-        </w:p>
-        <w:p>
-          <w:pPr>
-            <w:pStyle w:val="Sumrio2"/>
-            <w:tabs>
-              <w:tab w:val="clear" w:pos="8788"/>
-              <w:tab w:val="right" w:leader="dot" w:pos="9070"/>
-            </w:tabs>
-          </w:pPr>
-          <w:hyperlink w:anchor="__RefHeading___Toc1323_3344478164">
-            <w:r>
-              <w:rPr>
-                <w:rStyle w:val="IndexLink"/>
-              </w:rPr>
-              <w:t>3.3 Público-alvo</w:t>
-            </w:r>
-            <w:r>
-              <w:rPr>
-                <w:rStyle w:val="IndexLink"/>
-              </w:rPr>
-              <w:tab/>
-              <w:t>9</w:t>
-            </w:r>
-          </w:hyperlink>
-        </w:p>
-        <w:p>
-          <w:pPr>
-            <w:pStyle w:val="Sumrio2"/>
-            <w:tabs>
-              <w:tab w:val="clear" w:pos="8788"/>
-              <w:tab w:val="right" w:leader="dot" w:pos="9070"/>
-            </w:tabs>
-          </w:pPr>
-          <w:hyperlink w:anchor="__RefHeading___Toc1325_3344478164">
-            <w:r>
-              <w:rPr>
-                <w:rStyle w:val="IndexLink"/>
-              </w:rPr>
-              <w:t>3.4 Problema identificado</w:t>
-            </w:r>
-            <w:r>
-              <w:rPr>
-                <w:rStyle w:val="IndexLink"/>
-              </w:rPr>
-              <w:tab/>
-              <w:t>9</w:t>
-            </w:r>
-          </w:hyperlink>
-        </w:p>
-        <w:p>
-          <w:pPr>
-            <w:pStyle w:val="Sumrio2"/>
-            <w:tabs>
-              <w:tab w:val="clear" w:pos="8788"/>
-              <w:tab w:val="right" w:leader="dot" w:pos="9070"/>
-            </w:tabs>
-          </w:pPr>
-          <w:hyperlink w:anchor="__RefHeading___Toc1327_3344478164">
-            <w:r>
-              <w:rPr>
-                <w:rStyle w:val="IndexLink"/>
-              </w:rPr>
-              <w:t>3.5 Solução proposta</w:t>
-            </w:r>
-            <w:r>
-              <w:rPr>
-                <w:rStyle w:val="IndexLink"/>
-              </w:rPr>
-              <w:tab/>
-              <w:t>9</w:t>
-            </w:r>
-          </w:hyperlink>
-        </w:p>
-        <w:p>
-          <w:pPr>
-            <w:pStyle w:val="Sumrio1"/>
-            <w:tabs>
-              <w:tab w:val="clear" w:pos="9071"/>
-              <w:tab w:val="right" w:leader="dot" w:pos="9070"/>
-            </w:tabs>
-          </w:pPr>
-          <w:hyperlink w:anchor="__RefHeading___Toc1329_3344478164">
-            <w:r>
-              <w:rPr>
-                <w:rStyle w:val="IndexLink"/>
-              </w:rPr>
-              <w:t>4 REQUISITOS DO SISTEMA</w:t>
-            </w:r>
-            <w:r>
-              <w:rPr>
-                <w:rStyle w:val="IndexLink"/>
-              </w:rPr>
-              <w:tab/>
-              <w:t>10</w:t>
-            </w:r>
-          </w:hyperlink>
-        </w:p>
-        <w:p>
-          <w:pPr>
-            <w:pStyle w:val="Sumrio2"/>
-            <w:tabs>
-              <w:tab w:val="clear" w:pos="8788"/>
-              <w:tab w:val="right" w:leader="dot" w:pos="9070"/>
-            </w:tabs>
-          </w:pPr>
-          <w:hyperlink w:anchor="__RefHeading___Toc1331_3344478164">
-            <w:r>
-              <w:rPr>
-                <w:rStyle w:val="IndexLink"/>
-              </w:rPr>
-              <w:t>4.1 Requisitos funcionais</w:t>
-            </w:r>
-            <w:r>
-              <w:rPr>
-                <w:rStyle w:val="IndexLink"/>
-              </w:rPr>
-              <w:tab/>
-              <w:t>10</w:t>
-            </w:r>
-          </w:hyperlink>
-        </w:p>
-        <w:p>
-          <w:pPr>
-            <w:pStyle w:val="Sumrio2"/>
-            <w:tabs>
-              <w:tab w:val="clear" w:pos="8788"/>
-              <w:tab w:val="right" w:leader="dot" w:pos="9070"/>
-            </w:tabs>
-          </w:pPr>
-          <w:hyperlink w:anchor="__RefHeading___Toc1333_3344478164">
-            <w:r>
-              <w:rPr>
-                <w:rStyle w:val="IndexLink"/>
-              </w:rPr>
-              <w:t>4.2 Requisitos não funcionais</w:t>
-            </w:r>
-            <w:r>
-              <w:rPr>
-                <w:rStyle w:val="IndexLink"/>
-              </w:rPr>
-              <w:tab/>
-              <w:t>10</w:t>
-            </w:r>
-          </w:hyperlink>
-        </w:p>
-        <w:p>
-          <w:pPr>
-            <w:pStyle w:val="Sumrio1"/>
-            <w:tabs>
-              <w:tab w:val="clear" w:pos="9071"/>
-              <w:tab w:val="right" w:leader="dot" w:pos="9070"/>
-            </w:tabs>
-          </w:pPr>
-          <w:hyperlink w:anchor="__RefHeading___Toc1335_3344478164">
-            <w:r>
-              <w:rPr>
-                <w:rStyle w:val="IndexLink"/>
-              </w:rPr>
-              <w:t>5 MODELAGEM DO SISTEMA (DIAGRAMAS UML)</w:t>
-            </w:r>
-            <w:r>
-              <w:rPr>
-                <w:rStyle w:val="IndexLink"/>
-              </w:rPr>
-              <w:tab/>
-              <w:t>12</w:t>
-            </w:r>
-          </w:hyperlink>
-        </w:p>
-        <w:p>
-          <w:pPr>
-            <w:pStyle w:val="Sumrio2"/>
-            <w:tabs>
-              <w:tab w:val="clear" w:pos="8788"/>
-              <w:tab w:val="right" w:leader="dot" w:pos="9070"/>
-            </w:tabs>
-          </w:pPr>
-          <w:hyperlink w:anchor="__RefHeading___Toc1337_3344478164">
-            <w:r>
-              <w:rPr>
-                <w:rStyle w:val="IndexLink"/>
-              </w:rPr>
-              <w:t>5.1 Diagramas comportamentais da UML</w:t>
-            </w:r>
-            <w:r>
-              <w:rPr>
-                <w:rStyle w:val="IndexLink"/>
-              </w:rPr>
-              <w:tab/>
-              <w:t>12</w:t>
-            </w:r>
-          </w:hyperlink>
-        </w:p>
-        <w:p>
-          <w:pPr>
-            <w:pStyle w:val="Sumrio3"/>
-            <w:tabs>
-              <w:tab w:val="clear" w:pos="8504"/>
-              <w:tab w:val="right" w:leader="dot" w:pos="9070"/>
-            </w:tabs>
-          </w:pPr>
-          <w:hyperlink w:anchor="__RefHeading___Toc1339_3344478164">
-            <w:r>
-              <w:rPr>
-                <w:rStyle w:val="IndexLink"/>
-                <w:i/>
-                <w:iCs/>
-              </w:rPr>
-              <w:t>5.1.1 Diagrama de Caso de Uso</w:t>
-            </w:r>
-            <w:r>
-              <w:rPr>
-                <w:rStyle w:val="IndexLink"/>
-              </w:rPr>
-              <w:tab/>
-              <w:t>12</w:t>
-            </w:r>
-          </w:hyperlink>
-        </w:p>
-        <w:p>
-          <w:pPr>
-            <w:pStyle w:val="Sumrio3"/>
-            <w:tabs>
-              <w:tab w:val="clear" w:pos="8504"/>
-              <w:tab w:val="right" w:leader="dot" w:pos="9070"/>
-            </w:tabs>
-          </w:pPr>
-          <w:hyperlink w:anchor="__RefHeading___Toc1341_3344478164">
-            <w:r>
-              <w:rPr>
-                <w:rStyle w:val="IndexLink"/>
-                <w:i/>
-                <w:iCs/>
-              </w:rPr>
-              <w:t>5.1.2 Descrição dos casos de uso</w:t>
-            </w:r>
-            <w:r>
-              <w:rPr>
-                <w:rStyle w:val="IndexLink"/>
-              </w:rPr>
-              <w:tab/>
-              <w:t>14</w:t>
-            </w:r>
-          </w:hyperlink>
-        </w:p>
-        <w:p>
-          <w:pPr>
-            <w:pStyle w:val="Sumrio3"/>
-            <w:tabs>
-              <w:tab w:val="clear" w:pos="8504"/>
-              <w:tab w:val="right" w:leader="dot" w:pos="9070"/>
-            </w:tabs>
-          </w:pPr>
-          <w:hyperlink w:anchor="__RefHeading___Toc1343_3344478164">
-            <w:r>
-              <w:rPr>
-                <w:rStyle w:val="IndexLink"/>
-                <w:i/>
-                <w:iCs/>
-              </w:rPr>
-              <w:t>5.1.3 Diagrama de Sequência</w:t>
-            </w:r>
-            <w:r>
-              <w:rPr>
-                <w:rStyle w:val="IndexLink"/>
-              </w:rPr>
-              <w:tab/>
-              <w:t>15</w:t>
-            </w:r>
-          </w:hyperlink>
-        </w:p>
-        <w:p>
-          <w:pPr>
-            <w:pStyle w:val="Sumrio2"/>
-            <w:tabs>
-              <w:tab w:val="clear" w:pos="8788"/>
-              <w:tab w:val="right" w:leader="dot" w:pos="9070"/>
-            </w:tabs>
-          </w:pPr>
-          <w:hyperlink w:anchor="__RefHeading___Toc1345_3344478164">
-            <w:r>
-              <w:rPr>
-                <w:rStyle w:val="IndexLink"/>
-              </w:rPr>
-              <w:t>5.2 Diagramas estruturais da UML</w:t>
-            </w:r>
-            <w:r>
-              <w:rPr>
-                <w:rStyle w:val="IndexLink"/>
-              </w:rPr>
-              <w:tab/>
-              <w:t>17</w:t>
-            </w:r>
-          </w:hyperlink>
-        </w:p>
-        <w:p>
-          <w:pPr>
-            <w:pStyle w:val="Sumrio3"/>
-            <w:tabs>
-              <w:tab w:val="clear" w:pos="8504"/>
-              <w:tab w:val="right" w:leader="dot" w:pos="9070"/>
-            </w:tabs>
-          </w:pPr>
-          <w:hyperlink w:anchor="__RefHeading___Toc1347_3344478164">
-            <w:r>
-              <w:rPr>
-                <w:rStyle w:val="IndexLink"/>
-                <w:i/>
-                <w:iCs/>
-              </w:rPr>
-              <w:t>5.2.1 Diagrama de Classe</w:t>
-            </w:r>
-            <w:r>
-              <w:rPr>
-                <w:rStyle w:val="IndexLink"/>
-              </w:rPr>
-              <w:tab/>
-              <w:t>17</w:t>
-            </w:r>
-          </w:hyperlink>
-        </w:p>
-        <w:p>
-          <w:pPr>
-            <w:pStyle w:val="Sumrio3"/>
-            <w:tabs>
-              <w:tab w:val="clear" w:pos="8504"/>
-              <w:tab w:val="right" w:leader="dot" w:pos="9070"/>
-            </w:tabs>
-          </w:pPr>
-          <w:hyperlink w:anchor="__RefHeading___Toc1349_3344478164">
-            <w:r>
-              <w:rPr>
-                <w:rStyle w:val="IndexLink"/>
-                <w:i/>
-                <w:iCs/>
-              </w:rPr>
-              <w:t>5.2.2 Diagrama de Componentes</w:t>
-            </w:r>
-            <w:r>
-              <w:rPr>
-                <w:rStyle w:val="IndexLink"/>
-              </w:rPr>
-              <w:tab/>
-              <w:t>19</w:t>
-            </w:r>
-          </w:hyperlink>
-        </w:p>
-        <w:p>
-          <w:pPr>
-            <w:pStyle w:val="Sumrio1"/>
-            <w:tabs>
-              <w:tab w:val="clear" w:pos="9071"/>
-              <w:tab w:val="right" w:leader="dot" w:pos="9070"/>
-            </w:tabs>
-          </w:pPr>
-          <w:hyperlink w:anchor="__RefHeading___Toc1351_3344478164">
-            <w:r>
-              <w:rPr>
-                <w:rStyle w:val="IndexLink"/>
-              </w:rPr>
-              <w:t>6 TECNOLOGIAS UTILIZADAS</w:t>
-            </w:r>
-            <w:r>
-              <w:rPr>
-                <w:rStyle w:val="IndexLink"/>
-              </w:rPr>
-              <w:tab/>
-              <w:t>21</w:t>
-            </w:r>
-          </w:hyperlink>
-        </w:p>
-        <w:p>
-          <w:pPr>
-            <w:pStyle w:val="Sumrio1"/>
-            <w:tabs>
-              <w:tab w:val="clear" w:pos="9071"/>
-              <w:tab w:val="right" w:leader="dot" w:pos="9070"/>
-            </w:tabs>
-          </w:pPr>
-          <w:hyperlink w:anchor="__RefHeading___Toc1353_3344478164">
-            <w:r>
-              <w:rPr>
-                <w:rStyle w:val="IndexLink"/>
-              </w:rPr>
-              <w:t>7 CRONOGRAMA DE DESENVOLVIMENTO</w:t>
-            </w:r>
-            <w:r>
-              <w:rPr>
-                <w:rStyle w:val="IndexLink"/>
-              </w:rPr>
-              <w:tab/>
-              <w:t>22</w:t>
-            </w:r>
-          </w:hyperlink>
-        </w:p>
-        <w:p>
-          <w:pPr>
-            <w:pStyle w:val="Sumrio1"/>
-            <w:tabs>
-              <w:tab w:val="clear" w:pos="9071"/>
-              <w:tab w:val="right" w:leader="dot" w:pos="9070"/>
-            </w:tabs>
-          </w:pPr>
-          <w:hyperlink w:anchor="__RefHeading___Toc1355_3344478164">
-            <w:r>
-              <w:rPr>
-                <w:rStyle w:val="IndexLink"/>
-              </w:rPr>
-              <w:t>8 ORÇAMENTO PARA DESENVOLVIMENTO</w:t>
-            </w:r>
-            <w:r>
-              <w:rPr>
-                <w:rStyle w:val="IndexLink"/>
-              </w:rPr>
-              <w:tab/>
-              <w:t>23</w:t>
-            </w:r>
-          </w:hyperlink>
-        </w:p>
-        <w:p>
-          <w:pPr>
-            <w:pStyle w:val="Sumrio1"/>
-            <w:tabs>
-              <w:tab w:val="clear" w:pos="9071"/>
-              <w:tab w:val="right" w:leader="dot" w:pos="9070"/>
-            </w:tabs>
-          </w:pPr>
-          <w:hyperlink w:anchor="__RefHeading___Toc1357_3344478164">
-            <w:r>
-              <w:rPr>
-                <w:rStyle w:val="IndexLink"/>
-              </w:rPr>
-              <w:t>9 CONSIDERAÇÕES FINAIS</w:t>
-            </w:r>
-            <w:r>
-              <w:rPr>
-                <w:rStyle w:val="IndexLink"/>
-              </w:rPr>
-              <w:tab/>
-              <w:t>24</w:t>
-            </w:r>
-          </w:hyperlink>
-        </w:p>
-        <w:p>
-          <w:pPr>
-            <w:pStyle w:val="Sumrio1"/>
-            <w:tabs>
-              <w:tab w:val="clear" w:pos="9071"/>
-              <w:tab w:val="right" w:leader="dot" w:pos="9070"/>
-            </w:tabs>
-          </w:pPr>
-          <w:hyperlink w:anchor="__RefHeading___Toc1359_3344478164">
-            <w:r>
-              <w:rPr>
-                <w:rStyle w:val="IndexLink"/>
-              </w:rPr>
-              <w:t>REFERÊNCIAS</w:t>
-            </w:r>
-            <w:r>
-              <w:rPr>
-                <w:rStyle w:val="IndexLink"/>
-              </w:rPr>
-              <w:tab/>
-              <w:t>25</w:t>
-            </w:r>
-          </w:hyperlink>
-          <w:r>
-            <w:rPr>
-              <w:rStyle w:val="IndexLink"/>
-            </w:rPr>
+            <w:r>
+              <w:t xml:space="preserve">Atualize os campos (F9).</w:t>
+            </w:r>
             <w:fldChar w:fldCharType="end"/>
           </w:r>
         </w:p>

</xml_diff>

<commit_message>
docs(entrega-final): remove página em branco e adiciona vídeo human-paced E2E
- _strip_trailing_pagebreak_in_sdt remove o parágrafo "<w:p><w:r><w:br
  type=page/></w:r></w:p>" que ficava no fim do SDT da Lista de
  Figuras. Esse page break originalmente separava o Sumário (que
  ficava após as listas no template parcial); depois de mover o
  Sumário para a frente, ele somava com o page break da sectPr
  seguinte e gerava uma página em branco entre a Lista de Figuras
  e o Capítulo 1.
- Adiciona test-results/human-e2e.mp4 (3.7 MB) ao repo via -f, já que
  test-results/ está no .gitignore. É o vídeo único da suíte
  Playwright rodada em modo "human-paced" (1s de pausa entre ações),
  útil para revisão visual do fluxo completo.

Co-Authored-By: Claude Opus 4.7 <noreply@anthropic.com>
</commit_message>
<xml_diff>
--- a/docs/entrega-final/GymControl_ProjetoFinal.docx
+++ b/docs/entrega-final/GymControl_ProjetoFinal.docx
@@ -1586,11 +1586,6 @@
           </w:hyperlink>
           <w:r>
             <w:fldChar w:fldCharType="end"/>
-          </w:r>
-        </w:p>
-        <w:p>
-          <w:r>
-            <w:br w:type="page"/>
           </w:r>
         </w:p>
       </w:sdtContent>

</xml_diff>

<commit_message>
docs(entrega-final): atualiza data da capa para Junho de 2026
Capa da parcial trazia "Maio de 2026" (data da entrega anterior). Para
a entrega final, atualizada para "Junho de 2026" — afeta a capa e a
contracapa (duas ocorrências).

Revisão dos capítulos 9-11 confirmou que as demais informações batem
com o estado real do repositório: 11 módulos JS, 8 tabelas, 106 testes
Jest, 16 testes Playwright, cobertura 91% / lib 100%, MySQL 8.4, rate
limit 120/min API e 5/min login, 2 sub-redes privadas em zonas
distintas, URLs DyeAllPies (fork) e eduardo2580 (upstream).

Co-Authored-By: Claude Opus 4.7 <noreply@anthropic.com>
</commit_message>
<xml_diff>
--- a/docs/entrega-final/GymControl_ProjetoFinal.docx
+++ b/docs/entrega-final/GymControl_ProjetoFinal.docx
@@ -314,7 +314,7 @@
           <w:szCs w:val="28"/>
           <w:lang w:val="pt-BR"/>
         </w:rPr>
-        <w:t>Maio de 2026</w:t>
+        <w:t>Junho de 2026</w:t>
       </w:r>
       <w:r>
         <w:rPr>
@@ -575,7 +575,7 @@
           <w:szCs w:val="28"/>
           <w:lang w:val="pt-BR"/>
         </w:rPr>
-        <w:t>Maio de 2026</w:t>
+        <w:t>Junho de 2026</w:t>
       </w:r>
       <w:r>
         <w:rPr>

</xml_diff>